<commit_message>
Keep only what SIS2 needs
</commit_message>
<xml_diff>
--- a/report/SIS2_report.docx
+++ b/report/SIS2_report.docx
@@ -181,7 +181,7 @@
         <w:pStyle w:val="ListBullet"/>
       </w:pPr>
       <w:r>
-        <w:t>The data is relational: users, follows, designs, collectible editions and gift transfers reference each other and need foreign keys and transactions. A gift must move from one owner to another atomically, so a collectible is never owned twice or lost.</w:t>
+        <w:t>The data is relational: users own designs, and later follow each other and exchange gifts. Foreign keys and transactions keep that consistent (a gift moves from one owner to another in one step, never duplicated or lost).</w:t>
       </w:r>
     </w:p>
     <w:p>
@@ -939,7 +939,7 @@
           <w:b w:val="0"/>
           <w:i w:val="0"/>
         </w:rPr>
-        <w:t>Script: gcp/01_create_infra.sh, gcp/02_project_iam.sh.</w:t>
+        <w:t>Script: gcp/01_create_infra.sh. The people roles above are shown as the target setup for a team.</w:t>
       </w:r>
     </w:p>
     <w:p>
@@ -1159,7 +1159,7 @@
                 <w:rFonts w:ascii="Times New Roman" w:hAnsi="Times New Roman"/>
                 <w:sz w:val="22"/>
               </w:rPr>
-              <w:t>Deploys and operates the backend</w:t>
+              <w:t>Operates the backend and web server</w:t>
             </w:r>
           </w:p>
         </w:tc>
@@ -1173,7 +1173,7 @@
                 <w:rFonts w:ascii="Times New Roman" w:hAnsi="Times New Roman"/>
                 <w:sz w:val="22"/>
               </w:rPr>
-              <w:t>Write /srv/releases (setgid group devops)</w:t>
+              <w:t>Own home; member of developers</w:t>
             </w:r>
           </w:p>
         </w:tc>
@@ -1187,7 +1187,7 @@
                 <w:rFonts w:ascii="Times New Roman" w:hAnsi="Times New Roman"/>
                 <w:sz w:val="22"/>
               </w:rPr>
-              <w:t>systemctl start|stop|restart|status dressing-api; reload nginx, nginx -t; dressing-deploy</w:t>
+              <w:t>systemctl start|stop|restart|status dressing-api; systemctl reload nginx; nginx -t</w:t>
             </w:r>
           </w:p>
         </w:tc>
@@ -1289,7 +1289,7 @@
                 <w:rFonts w:ascii="Times New Roman" w:hAnsi="Times New Roman"/>
                 <w:sz w:val="22"/>
               </w:rPr>
-              <w:t>Read /var/backups/postgresql; DB role dba1 (schema owner via peer auth)</w:t>
+              <w:t>DB role dba1 (schema owner, peer auth)</w:t>
             </w:r>
           </w:p>
         </w:tc>
@@ -1303,7 +1303,7 @@
                 <w:rFonts w:ascii="Times New Roman" w:hAnsi="Times New Roman"/>
                 <w:sz w:val="22"/>
               </w:rPr>
-              <w:t>psql, pg_dump, pg_dumpall, pg_restore as user postgres; reload/restart/status postgresql</w:t>
+              <w:t>psql, pg_dump as user postgres; restart/status postgresql</w:t>
             </w:r>
           </w:p>
         </w:tc>
@@ -1347,7 +1347,7 @@
                 <w:rFonts w:ascii="Times New Roman" w:hAnsi="Times New Roman"/>
                 <w:sz w:val="22"/>
               </w:rPr>
-              <w:t>systemd-journal + adm groups (all logs); read /var/log/dressing</w:t>
+              <w:t>systemd-journal + adm groups (reads all logs)</w:t>
             </w:r>
           </w:p>
         </w:tc>
@@ -1361,7 +1361,7 @@
                 <w:rFonts w:ascii="Times New Roman" w:hAnsi="Times New Roman"/>
                 <w:sz w:val="22"/>
               </w:rPr>
-              <w:t>NOPASSWD, NOEXEC: cat /var/log/sudo.log, sudo -l -U &lt;user&gt;, apt list --upgradable</w:t>
+              <w:t>NOPASSWD, NOEXEC: cat /var/log/sudo.log, sudo -l -U &lt;user&gt;</w:t>
             </w:r>
           </w:p>
         </w:tc>
@@ -1405,7 +1405,7 @@
                 <w:rFonts w:ascii="Times New Roman" w:hAnsi="Times New Roman"/>
                 <w:sz w:val="22"/>
               </w:rPr>
-              <w:t>Member of devops (can upload releases)</w:t>
+              <w:t>Member of devops</w:t>
             </w:r>
           </w:p>
         </w:tc>
@@ -1419,7 +1419,7 @@
                 <w:rFonts w:ascii="Times New Roman" w:hAnsi="Times New Roman"/>
                 <w:sz w:val="22"/>
               </w:rPr>
-              <w:t>NOPASSWD: dressing-api service control, dressing-deploy</w:t>
+              <w:t>NOPASSWD: systemctl start|stop|restart|status dressing-api</w:t>
             </w:r>
           </w:p>
         </w:tc>
@@ -1463,7 +1463,7 @@
                 <w:rFonts w:ascii="Times New Roman" w:hAnsi="Times New Roman"/>
                 <w:sz w:val="22"/>
               </w:rPr>
-              <w:t>Read /opt/dressing, /etc/dressing; write only /var/lib/dressing, /var/log/dressing</w:t>
+              <w:t>Read /opt/dressing, /etc/dressing; write only /var/lib/dressing</w:t>
             </w:r>
           </w:p>
         </w:tc>
@@ -2437,180 +2437,6 @@
                 <w:rFonts w:ascii="Times New Roman" w:hAnsi="Times New Roman"/>
                 <w:sz w:val="22"/>
               </w:rPr>
-              <w:t>/srv/releases</w:t>
-            </w:r>
-          </w:p>
-        </w:tc>
-        <w:tc>
-          <w:tcPr>
-            <w:tcW w:type="dxa" w:w="2160"/>
-          </w:tcPr>
-          <w:p>
-            <w:r>
-              <w:rPr>
-                <w:rFonts w:ascii="Times New Roman" w:hAnsi="Times New Roman"/>
-                <w:sz w:val="22"/>
-              </w:rPr>
-              <w:t>root:devops</w:t>
-            </w:r>
-          </w:p>
-        </w:tc>
-        <w:tc>
-          <w:tcPr>
-            <w:tcW w:type="dxa" w:w="2160"/>
-          </w:tcPr>
-          <w:p>
-            <w:r>
-              <w:rPr>
-                <w:rFonts w:ascii="Times New Roman" w:hAnsi="Times New Roman"/>
-                <w:sz w:val="22"/>
-              </w:rPr>
-              <w:t>2775</w:t>
-            </w:r>
-          </w:p>
-        </w:tc>
-        <w:tc>
-          <w:tcPr>
-            <w:tcW w:type="dxa" w:w="2160"/>
-          </w:tcPr>
-          <w:p>
-            <w:r>
-              <w:rPr>
-                <w:rFonts w:ascii="Times New Roman" w:hAnsi="Times New Roman"/>
-                <w:sz w:val="22"/>
-              </w:rPr>
-              <w:t>DevOps upload releases; setgid keeps the group on new files</w:t>
-            </w:r>
-          </w:p>
-        </w:tc>
-      </w:tr>
-      <w:tr>
-        <w:tc>
-          <w:tcPr>
-            <w:tcW w:type="dxa" w:w="2160"/>
-          </w:tcPr>
-          <w:p>
-            <w:r>
-              <w:rPr>
-                <w:rFonts w:ascii="Times New Roman" w:hAnsi="Times New Roman"/>
-                <w:sz w:val="22"/>
-              </w:rPr>
-              <w:t>/var/log/dressing</w:t>
-            </w:r>
-          </w:p>
-        </w:tc>
-        <w:tc>
-          <w:tcPr>
-            <w:tcW w:type="dxa" w:w="2160"/>
-          </w:tcPr>
-          <w:p>
-            <w:r>
-              <w:rPr>
-                <w:rFonts w:ascii="Times New Roman" w:hAnsi="Times New Roman"/>
-                <w:sz w:val="22"/>
-              </w:rPr>
-              <w:t>dressing:auditors</w:t>
-            </w:r>
-          </w:p>
-        </w:tc>
-        <w:tc>
-          <w:tcPr>
-            <w:tcW w:type="dxa" w:w="2160"/>
-          </w:tcPr>
-          <w:p>
-            <w:r>
-              <w:rPr>
-                <w:rFonts w:ascii="Times New Roman" w:hAnsi="Times New Roman"/>
-                <w:sz w:val="22"/>
-              </w:rPr>
-              <w:t>2750</w:t>
-            </w:r>
-          </w:p>
-        </w:tc>
-        <w:tc>
-          <w:tcPr>
-            <w:tcW w:type="dxa" w:w="2160"/>
-          </w:tcPr>
-          <w:p>
-            <w:r>
-              <w:rPr>
-                <w:rFonts w:ascii="Times New Roman" w:hAnsi="Times New Roman"/>
-                <w:sz w:val="22"/>
-              </w:rPr>
-              <w:t>Application logs: auditors read, never write</w:t>
-            </w:r>
-          </w:p>
-        </w:tc>
-      </w:tr>
-      <w:tr>
-        <w:tc>
-          <w:tcPr>
-            <w:tcW w:type="dxa" w:w="2160"/>
-          </w:tcPr>
-          <w:p>
-            <w:r>
-              <w:rPr>
-                <w:rFonts w:ascii="Times New Roman" w:hAnsi="Times New Roman"/>
-                <w:sz w:val="22"/>
-              </w:rPr>
-              <w:t>/var/backups/postgresql</w:t>
-            </w:r>
-          </w:p>
-        </w:tc>
-        <w:tc>
-          <w:tcPr>
-            <w:tcW w:type="dxa" w:w="2160"/>
-          </w:tcPr>
-          <w:p>
-            <w:r>
-              <w:rPr>
-                <w:rFonts w:ascii="Times New Roman" w:hAnsi="Times New Roman"/>
-                <w:sz w:val="22"/>
-              </w:rPr>
-              <w:t>postgres:dba</w:t>
-            </w:r>
-          </w:p>
-        </w:tc>
-        <w:tc>
-          <w:tcPr>
-            <w:tcW w:type="dxa" w:w="2160"/>
-          </w:tcPr>
-          <w:p>
-            <w:r>
-              <w:rPr>
-                <w:rFonts w:ascii="Times New Roman" w:hAnsi="Times New Roman"/>
-                <w:sz w:val="22"/>
-              </w:rPr>
-              <w:t>2750</w:t>
-            </w:r>
-          </w:p>
-        </w:tc>
-        <w:tc>
-          <w:tcPr>
-            <w:tcW w:type="dxa" w:w="2160"/>
-          </w:tcPr>
-          <w:p>
-            <w:r>
-              <w:rPr>
-                <w:rFonts w:ascii="Times New Roman" w:hAnsi="Times New Roman"/>
-                <w:sz w:val="22"/>
-              </w:rPr>
-              <w:t>Database dumps, readable by DBAs</w:t>
-            </w:r>
-          </w:p>
-        </w:tc>
-      </w:tr>
-      <w:tr>
-        <w:tc>
-          <w:tcPr>
-            <w:tcW w:type="dxa" w:w="2160"/>
-          </w:tcPr>
-          <w:p>
-            <w:r>
-              <w:rPr>
-                <w:rFonts w:ascii="Times New Roman" w:hAnsi="Times New Roman"/>
-                <w:sz w:val="22"/>
-              </w:rPr>
               <w:t>/etc/sudoers.d/10-dressing</w:t>
             </w:r>
           </w:p>
@@ -2724,7 +2550,7 @@
           <w:b w:val="0"/>
           <w:i w:val="0"/>
         </w:rPr>
-        <w:t>The sudo policy is placed in /etc/sudoers.d instead of editing /etc/sudoers, and is checked with visudo before it is installed. Command aliases keep it readable. DevOps and the bot never get a root shell. Their only way to change the code is /usr/local/bin/dressing-deploy, a root-owned script that accepts only release archives with a strict name pattern.</w:t>
+        <w:t>The sudo policy is placed in /etc/sudoers.d instead of editing /etc/sudoers, and is checked with visudo before it is installed. Command aliases keep it readable. Every group gets only the exact commands its job needs; DevOps and the bot never get a root shell, and the bot (no password) can run only the app's service commands.</w:t>
       </w:r>
     </w:p>
     <w:p>
@@ -2763,36 +2589,30 @@
         <w:br/>
         <w:t>Cmnd_Alias  WEB_SVC   = /usr/bin/systemctl reload nginx, /usr/sbin/nginx -t</w:t>
         <w:br/>
-        <w:t>Cmnd_Alias  PG_SVC    = /usr/bin/systemctl reload postgresql, \</w:t>
-        <w:br/>
-        <w:t xml:space="preserve">                        /usr/bin/systemctl restart postgresql, \</w:t>
+        <w:t>Cmnd_Alias  PG_SVC    = /usr/bin/systemctl restart postgresql, \</w:t>
         <w:br/>
         <w:t xml:space="preserve">                        /usr/bin/systemctl status postgresql</w:t>
         <w:br/>
-        <w:t>Cmnd_Alias  PG_TOOLS  = /usr/bin/psql, /usr/bin/pg_dump, /usr/bin/pg_dumpall, /usr/bin/pg_restore</w:t>
-        <w:br/>
-        <w:t>Cmnd_Alias  DEPLOY    = /usr/local/bin/dressing-deploy</w:t>
+        <w:t>Cmnd_Alias  PG_TOOLS  = /usr/bin/psql, /usr/bin/pg_dump</w:t>
         <w:br/>
         <w:t>Cmnd_Alias  AUDIT     = /usr/bin/cat /var/log/sudo.log, /usr/bin/sudo -l -U *</w:t>
-        <w:br/>
-        <w:t>Cmnd_Alias  PKG_READ  = /usr/bin/apt list --upgradable</w:t>
         <w:br/>
         <w:br/>
         <w:t># ---- rules ---------------------------------------------------------------------------</w:t>
         <w:br/>
-        <w:t># Administrators: everything, but with their own password every time (5 min cache).</w:t>
+        <w:t># Administrators: everything, with their own password.</w:t>
         <w:br/>
         <w:t>%sysadmins    ALL=(ALL:ALL) ALL</w:t>
         <w:br/>
         <w:br/>
-        <w:t># DevOps: deploy and operate the app and web server, no shell as root.</w:t>
+        <w:t># DevOps: operate the app and the web server, no root shell.</w:t>
         <w:br/>
-        <w:t>%devops       ALL=(root) APP_SVC, WEB_SVC, DEPLOY</w:t>
+        <w:t>%devops       ALL=(root) APP_SVC, WEB_SVC</w:t>
         <w:br/>
         <w:br/>
-        <w:t># Automation bot: same as devops minus nginx, no password (it has none; SSH key only).</w:t>
+        <w:t># Automation bot: control the app, no password (it has none; SSH key only).</w:t>
         <w:br/>
-        <w:t>automation_bot ALL=(root) NOPASSWD: APP_SVC, DEPLOY</w:t>
+        <w:t>automation_bot ALL=(root) NOPASSWD: APP_SVC</w:t>
         <w:br/>
         <w:br/>
         <w:t># Developers: may only look at the service.</w:t>
@@ -2800,18 +2620,16 @@
         <w:t>%developers   ALL=(root) /usr/bin/systemctl status dressing-api</w:t>
         <w:br/>
         <w:br/>
-        <w:t># DBA: PostgreSQL tools as the postgres user, service control as root. Not a root shell.</w:t>
+        <w:t># DBA: database tools as the postgres user, service control as root.</w:t>
         <w:br/>
         <w:t>%dba          ALL=(postgres) PG_TOOLS</w:t>
         <w:br/>
         <w:t>%dba          ALL=(root) PG_SVC</w:t>
         <w:br/>
         <w:br/>
-        <w:t># Auditors: read sudo log + inspect anyone's sudo rights. Journal access comes from the</w:t>
+        <w:t># Auditors: read the sudo log, list anyone's sudo rights. Logs via the systemd-journal group.</w:t>
         <w:br/>
-        <w:t># systemd-journal group, so no sudo is needed for logs. NOEXEC blocks shell escapes.</w:t>
-        <w:br/>
-        <w:t>%auditors     ALL=(root) NOPASSWD: NOEXEC: AUDIT, PKG_READ</w:t>
+        <w:t>%auditors     ALL=(root) NOPASSWD: NOEXEC: AUDIT</w:t>
       </w:r>
     </w:p>
     <w:p>
@@ -2824,7 +2642,7 @@
         <w:br/>
         <w:t># Task 3: file permissions + sudoers for every group.</w:t>
         <w:br/>
-        <w:t># Run as root on BOTH VMs:  sudo ./20_permissions.sh</w:t>
+        <w:t># Run as root on BOTH VMs:  sudo linux/20_permissions.sh</w:t>
         <w:br/>
         <w:t>set -euo pipefail</w:t>
         <w:br/>
@@ -2837,23 +2655,15 @@
         <w:br/>
         <w:t>#  path                 owner:group          mode  why</w:t>
         <w:br/>
-        <w:t>#  /opt/dressing        root:dressing        0750  code: service can read/execute, not modify itself</w:t>
+        <w:t>#  /opt/dressing        root:dressing        0750  code: service can read/run it, not modify it</w:t>
         <w:br/>
         <w:t>#  /etc/dressing        root:dressing        0750  config + secrets</w:t>
         <w:br/>
         <w:t>#  /var/lib/dressing    dressing:dressing    0750  the only place the service may write</w:t>
         <w:br/>
-        <w:t>#  /srv/releases        root:devops          2775  devops drop release archives; setgid keeps group</w:t>
-        <w:br/>
-        <w:t>#  /var/log/dressing    dressing:auditors    2750  app logs; auditors read, never write</w:t>
-        <w:br/>
         <w:t>install -d -m 0750 -o root     -g dressing /opt/dressing /etc/dressing</w:t>
         <w:br/>
         <w:t>install -d -m 0750 -o dressing -g dressing /var/lib/dressing</w:t>
-        <w:br/>
-        <w:t>install -d -m 2775 -o root     -g devops   /srv/releases</w:t>
-        <w:br/>
-        <w:t>install -d -m 2750 -o dressing -g auditors /var/log/dressing</w:t>
         <w:br/>
         <w:br/>
         <w:t># Secrets file: root writes it, the service reads it, nobody else sees it.</w:t>
@@ -2863,20 +2673,6 @@
         <w:t>chown root:dressing /etc/dressing/dressing.env</w:t>
         <w:br/>
         <w:t>chmod 0640 /etc/dressing/dressing.env</w:t>
-        <w:br/>
-        <w:br/>
-        <w:t># Deploy helper: the only privileged entry point for devops/automation_bot.</w:t>
-        <w:br/>
-        <w:t>install -m 0755 -o root -g root "$HERE/dressing-deploy" /usr/local/bin/dressing-deploy</w:t>
-        <w:br/>
-        <w:br/>
-        <w:t># PostgreSQL backups (exists only on the DB VM).</w:t>
-        <w:br/>
-        <w:t>if id postgres &amp;&gt;/dev/null; then</w:t>
-        <w:br/>
-        <w:t xml:space="preserve">    install -d -m 2750 -o postgres -g dba /var/backups/postgresql</w:t>
-        <w:br/>
-        <w:t>fi</w:t>
         <w:br/>
         <w:br/>
         <w:t># --- sudoers: never edit /etc/sudoers itself, drop a file in sudoers.d ------------------</w:t>
@@ -2894,7 +2690,7 @@
         <w:t>touch /var/log/sudo.log &amp;&amp; chmod 0600 /var/log/sudo.log</w:t>
         <w:br/>
         <w:br/>
-        <w:t>echo "== directories"; ls -ld /opt/dressing /etc/dressing /etc/dressing/dressing.env /var/lib/dressing /srv/releases /var/log/dressing</w:t>
+        <w:t>echo "== directories"; ls -ld /opt/dressing /etc/dressing /etc/dressing/dressing.env /var/lib/dressing</w:t>
         <w:br/>
         <w:t>echo "== effective sudo rules";  for u in sysadmin1 devops1 developer1 dba1 auditor1 automation_bot; do echo "--- $u"; sudo -l -U "$u" | sed -n '/may run/,$p'; done</w:t>
       </w:r>
@@ -3314,8 +3110,6 @@
         <w:br/>
         <w:t>Description=Dressing backend API</w:t>
         <w:br/>
-        <w:t>Documentation=https://github.com/&lt;you&gt;/dressing-infra</w:t>
-        <w:br/>
         <w:t>Wants=network-online.target</w:t>
         <w:br/>
         <w:t>After=network-online.target</w:t>
@@ -3331,16 +3125,16 @@
         <w:br/>
         <w:t>EnvironmentFile=/etc/dressing/dressing.env</w:t>
         <w:br/>
-        <w:t>WorkingDirectory=/opt/dressing/current</w:t>
+        <w:t>WorkingDirectory=/opt/dressing</w:t>
         <w:br/>
-        <w:t>ExecStart=/usr/bin/python3 /opt/dressing/current/dressing_api.py</w:t>
+        <w:t>ExecStart=/usr/bin/python3 /opt/dressing/dressing_api.py</w:t>
         <w:br/>
         <w:t>Restart=on-failure</w:t>
         <w:br/>
         <w:t>RestartSec=3</w:t>
         <w:br/>
         <w:br/>
-        <w:t># Sandboxing: the service can write only its own state dir and log dir.</w:t>
+        <w:t># Sandboxing: the service can write only its own state directory.</w:t>
         <w:br/>
         <w:t>NoNewPrivileges=yes</w:t>
         <w:br/>
@@ -3350,21 +3144,7 @@
         <w:br/>
         <w:t>PrivateTmp=yes</w:t>
         <w:br/>
-        <w:t>PrivateDevices=yes</w:t>
-        <w:br/>
-        <w:t>ProtectKernelTunables=yes</w:t>
-        <w:br/>
-        <w:t>ProtectKernelModules=yes</w:t>
-        <w:br/>
-        <w:t>ProtectControlGroups=yes</w:t>
-        <w:br/>
-        <w:t>RestrictAddressFamilies=AF_INET AF_INET6 AF_UNIX</w:t>
-        <w:br/>
-        <w:t>ReadWritePaths=/var/lib/dressing /var/log/dressing</w:t>
-        <w:br/>
-        <w:t>CapabilityBoundingSet=</w:t>
-        <w:br/>
-        <w:t>MemoryMax=256M</w:t>
+        <w:t>ReadWritePaths=/var/lib/dressing</w:t>
         <w:br/>
         <w:br/>
         <w:t>[Install]</w:t>
@@ -3417,7 +3197,7 @@
           <w:b w:val="0"/>
           <w:i w:val="0"/>
         </w:rPr>
-        <w:t>The schema (db/schema.sql) already covers the planned features:</w:t>
+        <w:t>The schema (db/schema.sql) starts with users and their designs. Planned next:</w:t>
       </w:r>
     </w:p>
     <w:p>
@@ -3425,7 +3205,7 @@
         <w:pStyle w:val="ListBullet"/>
       </w:pPr>
       <w:r>
-        <w:t>Community tab: users, follows, designs with visibility private/friends/public, and a feed index on (visibility, created_at).</w:t>
+        <w:t>Community tab: following friends and a feed of public designs.</w:t>
       </w:r>
     </w:p>
     <w:p>
@@ -3433,7 +3213,7 @@
         <w:pStyle w:val="ListBullet"/>
       </w:pPr>
       <w:r>
-        <w:t>Gifts as collectibles: a design can be issued as a numbered edition; each item has one owner, and gift_transfers keeps the history of every hand-over.</w:t>
+        <w:t>Gifts as collectible items that move between users, recorded as transactions.</w:t>
       </w:r>
     </w:p>
     <w:p>
@@ -3441,7 +3221,7 @@
         <w:pStyle w:val="ListBullet"/>
       </w:pPr>
       <w:r>
-        <w:t>AR wardrobe: each design stores a model_key pointing to a USDZ file in object storage. The phone downloads it and fits it to the body with ARKit body tracking. Turning a 2D design into a 3D garment is a background job, which is where a worker VM or Cloud Run job would be added.</w:t>
+        <w:t>AR wardrobe: 3D versions of designs stored in Cloud Storage and fitted to the body on the phone. Generating the 3D models is the first job that would justify a third machine.</w:t>
       </w:r>
     </w:p>
     <w:p>

</xml_diff>